<commit_message>
Complete MATH_02_EN Session 1 worked examples and validation
</commit_message>
<xml_diff>
--- a/EN/KDP/MATH_02_EN.docx
+++ b/EN/KDP/MATH_02_EN.docx
@@ -2752,13 +2752,13 @@
           <m:rPr>
             <m:sty m:val="p"/>
           </m:rPr>
-          <m:t>₋(</m:t>
-        </m:r>
-        <m:r>
-          <m:rPr>
-            <m:sty m:val="i"/>
-          </m:rPr>
-          <m:t>c</m:t>
+          <m:t>(</m:t>
+        </m:r>
+        <m:r>
+          <m:rPr>
+            <m:sty m:val="i"/>
+          </m:rPr>
+          <m:t>x</m:t>
         </m:r>
         <m:r>
           <m:rPr>
@@ -2770,43 +2770,55 @@
           <m:rPr>
             <m:sty m:val="i"/>
           </m:rPr>
+          <m:t>x</m:t>
+        </m:r>
+        <m:r>
+          <m:rPr>
+            <m:sty m:val="p"/>
+          </m:rPr>
+          <m:t>²  </m:t>
+        </m:r>
+        <m:r>
+          <m:rPr>
+            <m:sty m:val="p"/>
+          </m:rPr>
+          <m:t>for</m:t>
+        </m:r>
+        <m:r>
+          <m:rPr>
+            <m:sty m:val="p"/>
+          </m:rPr>
+          <m:t> </m:t>
+        </m:r>
+        <m:r>
+          <m:rPr>
+            <m:sty m:val="i"/>
+          </m:rPr>
+          <m:t>x</m:t>
+        </m:r>
+        <m:r>
+          <m:rPr>
+            <m:sty m:val="p"/>
+          </m:rPr>
+          <m:t>≤1;  </m:t>
+        </m:r>
+        <m:r>
+          <m:rPr>
+            <m:sty m:val="i"/>
+          </m:rPr>
           <m:t>f</m:t>
         </m:r>
         <m:r>
           <m:rPr>
             <m:sty m:val="p"/>
           </m:rPr>
-          <m:t>₊(</m:t>
-        </m:r>
-        <m:r>
-          <m:rPr>
-            <m:sty m:val="i"/>
-          </m:rPr>
-          <m:t>c</m:t>
-        </m:r>
-        <m:r>
-          <m:rPr>
-            <m:sty m:val="p"/>
-          </m:rPr>
-          <m:t>),  </m:t>
-        </m:r>
-        <m:r>
-          <m:rPr>
-            <m:sty m:val="i"/>
-          </m:rPr>
-          <m:t>f</m:t>
-        </m:r>
-        <m:r>
-          <m:rPr>
-            <m:sty m:val="p"/>
-          </m:rPr>
-          <m:t>₋′(</m:t>
-        </m:r>
-        <m:r>
-          <m:rPr>
-            <m:sty m:val="i"/>
-          </m:rPr>
-          <m:t>c</m:t>
+          <m:t>(</m:t>
+        </m:r>
+        <m:r>
+          <m:rPr>
+            <m:sty m:val="i"/>
+          </m:rPr>
+          <m:t>x</m:t>
         </m:r>
         <m:r>
           <m:rPr>
@@ -2818,25 +2830,115 @@
           <m:rPr>
             <m:sty m:val="i"/>
           </m:rPr>
-          <m:t>f</m:t>
-        </m:r>
-        <m:r>
-          <m:rPr>
-            <m:sty m:val="p"/>
-          </m:rPr>
-          <m:t>₊′(</m:t>
-        </m:r>
-        <m:r>
-          <m:rPr>
-            <m:sty m:val="i"/>
-          </m:rPr>
-          <m:t>c</m:t>
-        </m:r>
-        <m:r>
-          <m:rPr>
-            <m:sty m:val="p"/>
-          </m:rPr>
-          <m:t>)</m:t>
+          <m:t>a</m:t>
+        </m:r>
+        <m:r>
+          <m:rPr>
+            <m:sty m:val="i"/>
+          </m:rPr>
+          <m:t>x</m:t>
+        </m:r>
+        <m:r>
+          <m:rPr>
+            <m:sty m:val="p"/>
+          </m:rPr>
+          <m:t>+</m:t>
+        </m:r>
+        <m:r>
+          <m:rPr>
+            <m:sty m:val="i"/>
+          </m:rPr>
+          <m:t>b</m:t>
+        </m:r>
+        <m:r>
+          <m:rPr>
+            <m:sty m:val="p"/>
+          </m:rPr>
+          <m:t>  </m:t>
+        </m:r>
+        <m:r>
+          <m:rPr>
+            <m:sty m:val="p"/>
+          </m:rPr>
+          <m:t>for</m:t>
+        </m:r>
+        <m:r>
+          <m:rPr>
+            <m:sty m:val="p"/>
+          </m:rPr>
+          <m:t> </m:t>
+        </m:r>
+        <m:r>
+          <m:rPr>
+            <m:sty m:val="i"/>
+          </m:rPr>
+          <m:t>x</m:t>
+        </m:r>
+        <m:r>
+          <m:rPr>
+            <m:sty m:val="p"/>
+          </m:rPr>
+          <m:t>&gt;1;  </m:t>
+        </m:r>
+        <m:r>
+          <m:rPr>
+            <m:sty m:val="i"/>
+          </m:rPr>
+          <m:t>a</m:t>
+        </m:r>
+        <m:r>
+          <m:rPr>
+            <m:sty m:val="p"/>
+          </m:rPr>
+          <m:t>+</m:t>
+        </m:r>
+        <m:r>
+          <m:rPr>
+            <m:sty m:val="i"/>
+          </m:rPr>
+          <m:t>b</m:t>
+        </m:r>
+        <m:r>
+          <m:rPr>
+            <m:sty m:val="p"/>
+          </m:rPr>
+          <m:t>=1,  </m:t>
+        </m:r>
+        <m:r>
+          <m:rPr>
+            <m:sty m:val="i"/>
+          </m:rPr>
+          <m:t>a</m:t>
+        </m:r>
+        <m:r>
+          <m:rPr>
+            <m:sty m:val="p"/>
+          </m:rPr>
+          <m:t>=2  ⇒  </m:t>
+        </m:r>
+        <m:r>
+          <m:rPr>
+            <m:sty m:val="i"/>
+          </m:rPr>
+          <m:t>a</m:t>
+        </m:r>
+        <m:r>
+          <m:rPr>
+            <m:sty m:val="p"/>
+          </m:rPr>
+          <m:t>=2, </m:t>
+        </m:r>
+        <m:r>
+          <m:rPr>
+            <m:sty m:val="i"/>
+          </m:rPr>
+          <m:t>b</m:t>
+        </m:r>
+        <m:r>
+          <m:rPr>
+            <m:sty m:val="p"/>
+          </m:rPr>
+          <m:t>=−1</m:t>
         </m:r>
       </m:oMath>
       <w:r>
@@ -2847,6 +2949,79 @@
         </w:rPr>
         <w:tab/>
         <w:t>(1.14)</w:t>
+      </w:r>
+    </w:p>
+    <w:p>
+      <w:r>
+        <w:rPr>
+          <w:lang w:val="en-US"/>
+        </w:rPr>
+        <w:t xml:space="preserve">For the displayed branches, continuity at the junction gives the equation </w:t>
+      </w:r>
+      <w:r>
+        <w:rPr>
+          <w:i/>
+          <w:lang w:val="en-US"/>
+        </w:rPr>
+        <w:t>a</w:t>
+      </w:r>
+      <w:r>
+        <w:rPr>
+          <w:lang w:val="en-US"/>
+        </w:rPr>
+        <w:t xml:space="preserve"> plus </w:t>
+      </w:r>
+      <w:r>
+        <w:rPr>
+          <w:i/>
+          <w:lang w:val="en-US"/>
+        </w:rPr>
+        <w:t>b</w:t>
+      </w:r>
+      <w:r>
+        <w:rPr>
+          <w:lang w:val="en-US"/>
+        </w:rPr>
+        <w:t xml:space="preserve"> equals one. The left derivative at the junction equals two, while the right derivative equals </w:t>
+      </w:r>
+      <w:r>
+        <w:rPr>
+          <w:i/>
+          <w:lang w:val="en-US"/>
+        </w:rPr>
+        <w:t>a</w:t>
+      </w:r>
+      <w:r>
+        <w:rPr>
+          <w:lang w:val="en-US"/>
+        </w:rPr>
+        <w:t xml:space="preserve">, so slope matching gives </w:t>
+      </w:r>
+      <w:r>
+        <w:rPr>
+          <w:i/>
+          <w:lang w:val="en-US"/>
+        </w:rPr>
+        <w:t>a</w:t>
+      </w:r>
+      <w:r>
+        <w:rPr>
+          <w:lang w:val="en-US"/>
+        </w:rPr>
+        <w:t xml:space="preserve"> equals two. Substitution into the continuity equation then gives </w:t>
+      </w:r>
+      <w:r>
+        <w:rPr>
+          <w:i/>
+          <w:lang w:val="en-US"/>
+        </w:rPr>
+        <w:t>b</w:t>
+      </w:r>
+      <w:r>
+        <w:rPr>
+          <w:lang w:val="en-US"/>
+        </w:rPr>
+        <w:t xml:space="preserve"> equals negative one. Checking the final branches confirms a common value of one and a common derivative of two at the junction.</w:t>
       </w:r>
     </w:p>
     <w:p>
@@ -2928,7 +3103,7 @@
           <m:rPr>
             <m:sty m:val="i"/>
           </m:rPr>
-          <m:t>a</m:t>
+          <m:t>x</m:t>
         </m:r>
         <m:r>
           <m:rPr>
@@ -2944,9 +3119,63 @@
         </m:r>
         <m:r>
           <m:rPr>
-            <m:sty m:val="p"/>
-          </m:rPr>
-          <m:t>,  </m:t>
+            <m:sty m:val="i"/>
+          </m:rPr>
+          <m:t>x</m:t>
+        </m:r>
+        <m:r>
+          <m:rPr>
+            <m:sty m:val="p"/>
+          </m:rPr>
+          <m:t>³+</m:t>
+        </m:r>
+        <m:r>
+          <m:rPr>
+            <m:sty m:val="i"/>
+          </m:rPr>
+          <m:t>B</m:t>
+        </m:r>
+        <m:r>
+          <m:rPr>
+            <m:sty m:val="i"/>
+          </m:rPr>
+          <m:t>x</m:t>
+        </m:r>
+        <m:r>
+          <m:rPr>
+            <m:sty m:val="p"/>
+          </m:rPr>
+          <m:t>²+</m:t>
+        </m:r>
+        <m:r>
+          <m:rPr>
+            <m:sty m:val="i"/>
+          </m:rPr>
+          <m:t>C</m:t>
+        </m:r>
+        <m:r>
+          <m:rPr>
+            <m:sty m:val="i"/>
+          </m:rPr>
+          <m:t>x</m:t>
+        </m:r>
+        <m:r>
+          <m:rPr>
+            <m:sty m:val="p"/>
+          </m:rPr>
+          <m:t>+</m:t>
+        </m:r>
+        <m:r>
+          <m:rPr>
+            <m:sty m:val="p"/>
+          </m:rPr>
+          <m:t>D</m:t>
+        </m:r>
+        <m:r>
+          <m:rPr>
+            <m:sty m:val="p"/>
+          </m:rPr>
+          <m:t>;  </m:t>
         </m:r>
         <m:r>
           <m:rPr>
@@ -2958,31 +3187,7 @@
           <m:rPr>
             <m:sty m:val="p"/>
           </m:rPr>
-          <m:t>′(</m:t>
-        </m:r>
-        <m:r>
-          <m:rPr>
-            <m:sty m:val="i"/>
-          </m:rPr>
-          <m:t>a</m:t>
-        </m:r>
-        <m:r>
-          <m:rPr>
-            <m:sty m:val="p"/>
-          </m:rPr>
-          <m:t>)=</m:t>
-        </m:r>
-        <m:r>
-          <m:rPr>
-            <m:sty m:val="i"/>
-          </m:rPr>
-          <m:t>S</m:t>
-        </m:r>
-        <m:r>
-          <m:rPr>
-            <m:sty m:val="p"/>
-          </m:rPr>
-          <m:t>ₐ,  </m:t>
+          <m:t>(0)=0, </m:t>
         </m:r>
         <m:r>
           <m:rPr>
@@ -2994,73 +3199,85 @@
           <m:rPr>
             <m:sty m:val="p"/>
           </m:rPr>
+          <m:t>′(0)=1, </m:t>
+        </m:r>
+        <m:r>
+          <m:rPr>
+            <m:sty m:val="i"/>
+          </m:rPr>
+          <m:t>p</m:t>
+        </m:r>
+        <m:r>
+          <m:rPr>
+            <m:sty m:val="p"/>
+          </m:rPr>
+          <m:t>(1)=1, </m:t>
+        </m:r>
+        <m:r>
+          <m:rPr>
+            <m:sty m:val="i"/>
+          </m:rPr>
+          <m:t>p</m:t>
+        </m:r>
+        <m:r>
+          <m:rPr>
+            <m:sty m:val="p"/>
+          </m:rPr>
+          <m:t>′(1)=0  ⇒  </m:t>
+        </m:r>
+        <m:r>
+          <m:rPr>
+            <m:sty m:val="i"/>
+          </m:rPr>
+          <m:t>p</m:t>
+        </m:r>
+        <m:r>
+          <m:rPr>
+            <m:sty m:val="p"/>
+          </m:rPr>
           <m:t>(</m:t>
         </m:r>
         <m:r>
           <m:rPr>
             <m:sty m:val="i"/>
           </m:rPr>
-          <m:t>b</m:t>
-        </m:r>
-        <m:r>
-          <m:rPr>
-            <m:sty m:val="p"/>
-          </m:rPr>
-          <m:t>)=</m:t>
-        </m:r>
-        <m:r>
-          <m:rPr>
-            <m:sty m:val="i"/>
-          </m:rPr>
-          <m:t>B</m:t>
-        </m:r>
-        <m:r>
-          <m:rPr>
-            <m:sty m:val="p"/>
-          </m:rPr>
-          <m:t>,  </m:t>
-        </m:r>
-        <m:r>
-          <m:rPr>
-            <m:sty m:val="i"/>
-          </m:rPr>
-          <m:t>p</m:t>
-        </m:r>
-        <m:r>
-          <m:rPr>
-            <m:sty m:val="p"/>
-          </m:rPr>
-          <m:t>′(</m:t>
-        </m:r>
-        <m:r>
-          <m:rPr>
-            <m:sty m:val="i"/>
-          </m:rPr>
-          <m:t>b</m:t>
-        </m:r>
-        <m:r>
-          <m:rPr>
-            <m:sty m:val="p"/>
-          </m:rPr>
-          <m:t>)=</m:t>
-        </m:r>
-        <m:r>
-          <m:rPr>
-            <m:sty m:val="i"/>
-          </m:rPr>
-          <m:t>S</m:t>
-        </m:r>
-        <m:r>
-          <m:rPr>
-            <m:sty m:val="p"/>
-          </m:rPr>
-          <m:t>_</m:t>
-        </m:r>
-        <m:r>
-          <m:rPr>
-            <m:sty m:val="i"/>
-          </m:rPr>
-          <m:t>b</m:t>
+          <m:t>x</m:t>
+        </m:r>
+        <m:r>
+          <m:rPr>
+            <m:sty m:val="p"/>
+          </m:rPr>
+          <m:t>)=−</m:t>
+        </m:r>
+        <m:r>
+          <m:rPr>
+            <m:sty m:val="i"/>
+          </m:rPr>
+          <m:t>x</m:t>
+        </m:r>
+        <m:r>
+          <m:rPr>
+            <m:sty m:val="p"/>
+          </m:rPr>
+          <m:t>³+</m:t>
+        </m:r>
+        <m:r>
+          <m:rPr>
+            <m:sty m:val="i"/>
+          </m:rPr>
+          <m:t>x</m:t>
+        </m:r>
+        <m:r>
+          <m:rPr>
+            <m:sty m:val="p"/>
+          </m:rPr>
+          <m:t>²+</m:t>
+        </m:r>
+        <m:r>
+          <m:rPr>
+            <m:sty m:val="i"/>
+          </m:rPr>
+          <m:t>x</m:t>
         </m:r>
       </m:oMath>
       <w:r>
@@ -3071,6 +3288,118 @@
         </w:rPr>
         <w:tab/>
         <w:t>(1.15)</w:t>
+      </w:r>
+    </w:p>
+    <w:p>
+      <w:r>
+        <w:rPr>
+          <w:lang w:val="en-US"/>
+        </w:rPr>
+        <w:t xml:space="preserve">For the cubic shown, the first value condition gives </w:t>
+      </w:r>
+      <w:r>
+        <w:rPr>
+          <w:i/>
+          <w:lang w:val="en-US"/>
+        </w:rPr>
+        <w:t>D</w:t>
+      </w:r>
+      <w:r>
+        <w:rPr>
+          <w:lang w:val="en-US"/>
+        </w:rPr>
+        <w:t xml:space="preserve"> equal to zero and the first sensitivity condition gives </w:t>
+      </w:r>
+      <w:r>
+        <w:rPr>
+          <w:i/>
+          <w:lang w:val="en-US"/>
+        </w:rPr>
+        <w:t>C</w:t>
+      </w:r>
+      <w:r>
+        <w:rPr>
+          <w:lang w:val="en-US"/>
+        </w:rPr>
+        <w:t xml:space="preserve"> equal to one. The second value condition then reduces to </w:t>
+      </w:r>
+      <w:r>
+        <w:rPr>
+          <w:i/>
+          <w:lang w:val="en-US"/>
+        </w:rPr>
+        <w:t>A</w:t>
+      </w:r>
+      <w:r>
+        <w:rPr>
+          <w:lang w:val="en-US"/>
+        </w:rPr>
+        <w:t xml:space="preserve"> plus </w:t>
+      </w:r>
+      <w:r>
+        <w:rPr>
+          <w:i/>
+          <w:lang w:val="en-US"/>
+        </w:rPr>
+        <w:t>B</w:t>
+      </w:r>
+      <w:r>
+        <w:rPr>
+          <w:lang w:val="en-US"/>
+        </w:rPr>
+        <w:t xml:space="preserve"> equal to zero, while the second sensitivity condition reduces to three </w:t>
+      </w:r>
+      <w:r>
+        <w:rPr>
+          <w:i/>
+          <w:lang w:val="en-US"/>
+        </w:rPr>
+        <w:t>A</w:t>
+      </w:r>
+      <w:r>
+        <w:rPr>
+          <w:lang w:val="en-US"/>
+        </w:rPr>
+        <w:t xml:space="preserve"> plus two </w:t>
+      </w:r>
+      <w:r>
+        <w:rPr>
+          <w:i/>
+          <w:lang w:val="en-US"/>
+        </w:rPr>
+        <w:t>B</w:t>
+      </w:r>
+      <w:r>
+        <w:rPr>
+          <w:lang w:val="en-US"/>
+        </w:rPr>
+        <w:t xml:space="preserve"> plus one equal to zero. Solving gives </w:t>
+      </w:r>
+      <w:r>
+        <w:rPr>
+          <w:i/>
+          <w:lang w:val="en-US"/>
+        </w:rPr>
+        <w:t>A</w:t>
+      </w:r>
+      <w:r>
+        <w:rPr>
+          <w:lang w:val="en-US"/>
+        </w:rPr>
+        <w:t xml:space="preserve"> equal to negative one and </w:t>
+      </w:r>
+      <w:r>
+        <w:rPr>
+          <w:i/>
+          <w:lang w:val="en-US"/>
+        </w:rPr>
+        <w:t>B</w:t>
+      </w:r>
+      <w:r>
+        <w:rPr>
+          <w:lang w:val="en-US"/>
+        </w:rPr>
+        <w:t xml:space="preserve"> equal to one, producing the stated correction polynomial.</w:t>
       </w:r>
     </w:p>
     <w:p>
@@ -6452,25 +6781,61 @@
           <m:rPr>
             <m:sty m:val="i"/>
           </m:rPr>
+          <m:t>x</m:t>
+        </m:r>
+        <m:r>
+          <m:rPr>
+            <m:sty m:val="p"/>
+          </m:rPr>
+          <m:t>)=</m:t>
+        </m:r>
+        <m:r>
+          <m:rPr>
+            <m:sty m:val="i"/>
+          </m:rPr>
+          <m:t>x</m:t>
+        </m:r>
+        <m:r>
+          <m:rPr>
+            <m:sty m:val="p"/>
+          </m:rPr>
+          <m:t>³+</m:t>
+        </m:r>
+        <m:r>
+          <m:rPr>
+            <m:sty m:val="i"/>
+          </m:rPr>
           <m:t>a</m:t>
         </m:r>
         <m:r>
           <m:rPr>
-            <m:sty m:val="p"/>
-          </m:rPr>
-          <m:t>)=</m:t>
-        </m:r>
-        <m:r>
-          <m:rPr>
-            <m:sty m:val="i"/>
-          </m:rPr>
-          <m:t>A</m:t>
-        </m:r>
-        <m:r>
-          <m:rPr>
-            <m:sty m:val="p"/>
-          </m:rPr>
-          <m:t>,  </m:t>
+            <m:sty m:val="i"/>
+          </m:rPr>
+          <m:t>x</m:t>
+        </m:r>
+        <m:r>
+          <m:rPr>
+            <m:sty m:val="p"/>
+          </m:rPr>
+          <m:t>²+</m:t>
+        </m:r>
+        <m:r>
+          <m:rPr>
+            <m:sty m:val="i"/>
+          </m:rPr>
+          <m:t>b</m:t>
+        </m:r>
+        <m:r>
+          <m:rPr>
+            <m:sty m:val="i"/>
+          </m:rPr>
+          <m:t>x</m:t>
+        </m:r>
+        <m:r>
+          <m:rPr>
+            <m:sty m:val="p"/>
+          </m:rPr>
+          <m:t>+1;  </m:t>
         </m:r>
         <m:r>
           <m:rPr>
@@ -6482,7 +6847,31 @@
           <m:rPr>
             <m:sty m:val="p"/>
           </m:rPr>
-          <m:t>′(</m:t>
+          <m:t>(1)=4, </m:t>
+        </m:r>
+        <m:r>
+          <m:rPr>
+            <m:sty m:val="i"/>
+          </m:rPr>
+          <m:t>p</m:t>
+        </m:r>
+        <m:r>
+          <m:rPr>
+            <m:sty m:val="p"/>
+          </m:rPr>
+          <m:t>′(1)=0  ⇒  </m:t>
+        </m:r>
+        <m:r>
+          <m:rPr>
+            <m:sty m:val="i"/>
+          </m:rPr>
+          <m:t>a</m:t>
+        </m:r>
+        <m:r>
+          <m:rPr>
+            <m:sty m:val="p"/>
+          </m:rPr>
+          <m:t>=−5, </m:t>
         </m:r>
         <m:r>
           <m:rPr>
@@ -6494,7 +6883,7 @@
           <m:rPr>
             <m:sty m:val="p"/>
           </m:rPr>
-          <m:t>)=0</m:t>
+          <m:t>=7</m:t>
         </m:r>
       </m:oMath>
       <w:r>
@@ -6505,6 +6894,118 @@
         </w:rPr>
         <w:tab/>
         <w:t>(2.15)</w:t>
+      </w:r>
+    </w:p>
+    <w:p>
+      <w:r>
+        <w:rPr>
+          <w:lang w:val="en-US"/>
+        </w:rPr>
+        <w:t xml:space="preserve">For the displayed cubic, the value requirement at one gives </w:t>
+      </w:r>
+      <w:r>
+        <w:rPr>
+          <w:i/>
+          <w:lang w:val="en-US"/>
+        </w:rPr>
+        <w:t>a</w:t>
+      </w:r>
+      <w:r>
+        <w:rPr>
+          <w:lang w:val="en-US"/>
+        </w:rPr>
+        <w:t xml:space="preserve"> plus </w:t>
+      </w:r>
+      <w:r>
+        <w:rPr>
+          <w:i/>
+          <w:lang w:val="en-US"/>
+        </w:rPr>
+        <w:t>b</w:t>
+      </w:r>
+      <w:r>
+        <w:rPr>
+          <w:lang w:val="en-US"/>
+        </w:rPr>
+        <w:t xml:space="preserve"> equal to two. Differentiation produces three squared inputs plus two </w:t>
+      </w:r>
+      <w:r>
+        <w:rPr>
+          <w:i/>
+          <w:lang w:val="en-US"/>
+        </w:rPr>
+        <w:t>a</w:t>
+      </w:r>
+      <w:r>
+        <w:rPr>
+          <w:lang w:val="en-US"/>
+        </w:rPr>
+        <w:t xml:space="preserve"> times the input plus </w:t>
+      </w:r>
+      <w:r>
+        <w:rPr>
+          <w:i/>
+          <w:lang w:val="en-US"/>
+        </w:rPr>
+        <w:t>b</w:t>
+      </w:r>
+      <w:r>
+        <w:rPr>
+          <w:lang w:val="en-US"/>
+        </w:rPr>
+        <w:t xml:space="preserve">, so the stationary requirement at one gives two </w:t>
+      </w:r>
+      <w:r>
+        <w:rPr>
+          <w:i/>
+          <w:lang w:val="en-US"/>
+        </w:rPr>
+        <w:t>a</w:t>
+      </w:r>
+      <w:r>
+        <w:rPr>
+          <w:lang w:val="en-US"/>
+        </w:rPr>
+        <w:t xml:space="preserve"> plus </w:t>
+      </w:r>
+      <w:r>
+        <w:rPr>
+          <w:i/>
+          <w:lang w:val="en-US"/>
+        </w:rPr>
+        <w:t>b</w:t>
+      </w:r>
+      <w:r>
+        <w:rPr>
+          <w:lang w:val="en-US"/>
+        </w:rPr>
+        <w:t xml:space="preserve"> equal to negative three. Subtracting the first coefficient equation gives </w:t>
+      </w:r>
+      <w:r>
+        <w:rPr>
+          <w:i/>
+          <w:lang w:val="en-US"/>
+        </w:rPr>
+        <w:t>a</w:t>
+      </w:r>
+      <w:r>
+        <w:rPr>
+          <w:lang w:val="en-US"/>
+        </w:rPr>
+        <w:t xml:space="preserve"> equal to negative five, and substitution gives </w:t>
+      </w:r>
+      <w:r>
+        <w:rPr>
+          <w:i/>
+          <w:lang w:val="en-US"/>
+        </w:rPr>
+        <w:t>b</w:t>
+      </w:r>
+      <w:r>
+        <w:rPr>
+          <w:lang w:val="en-US"/>
+        </w:rPr>
+        <w:t xml:space="preserve"> equal to seven. Both original requirements are satisfied exactly.</w:t>
       </w:r>
     </w:p>
     <w:p>
@@ -6564,6 +7065,54 @@
           <m:rPr>
             <m:sty m:val="p"/>
           </m:rPr>
+          <m:t>(0)=0, </m:t>
+        </m:r>
+        <m:r>
+          <m:rPr>
+            <m:sty m:val="i"/>
+          </m:rPr>
+          <m:t>p</m:t>
+        </m:r>
+        <m:r>
+          <m:rPr>
+            <m:sty m:val="p"/>
+          </m:rPr>
+          <m:t>′(0)=1, </m:t>
+        </m:r>
+        <m:r>
+          <m:rPr>
+            <m:sty m:val="i"/>
+          </m:rPr>
+          <m:t>p</m:t>
+        </m:r>
+        <m:r>
+          <m:rPr>
+            <m:sty m:val="p"/>
+          </m:rPr>
+          <m:t>(2)=3, </m:t>
+        </m:r>
+        <m:r>
+          <m:rPr>
+            <m:sty m:val="i"/>
+          </m:rPr>
+          <m:t>p</m:t>
+        </m:r>
+        <m:r>
+          <m:rPr>
+            <m:sty m:val="p"/>
+          </m:rPr>
+          <m:t>′(2)=0  ⇒  </m:t>
+        </m:r>
+        <m:r>
+          <m:rPr>
+            <m:sty m:val="i"/>
+          </m:rPr>
+          <m:t>p</m:t>
+        </m:r>
+        <m:r>
+          <m:rPr>
+            <m:sty m:val="p"/>
+          </m:rPr>
           <m:t>(</m:t>
         </m:r>
         <m:r>
@@ -6576,32 +7125,26 @@
           <m:rPr>
             <m:sty m:val="p"/>
           </m:rPr>
-          <m:t>)=</m:t>
-        </m:r>
-        <m:r>
-          <m:rPr>
-            <m:sty m:val="i"/>
-          </m:rPr>
-          <m:t>a</m:t>
-        </m:r>
-        <m:r>
-          <m:rPr>
-            <m:sty m:val="p"/>
-          </m:rPr>
-          <m:t>₀+</m:t>
-        </m:r>
-        <m:r>
-          <m:rPr>
-            <m:sty m:val="i"/>
-          </m:rPr>
-          <m:t>a</m:t>
-        </m:r>
-        <m:r>
-          <m:rPr>
-            <m:sty m:val="p"/>
-          </m:rPr>
-          <m:t>₁</m:t>
-        </m:r>
+          <m:t>)=−</m:t>
+        </m:r>
+        <m:f>
+          <m:num>
+            <m:r>
+              <m:rPr>
+                <m:sty m:val="p"/>
+              </m:rPr>
+              <m:t>1</m:t>
+            </m:r>
+          </m:num>
+          <m:den>
+            <m:r>
+              <m:rPr>
+                <m:sty m:val="p"/>
+              </m:rPr>
+              <m:t>2</m:t>
+            </m:r>
+          </m:den>
+        </m:f>
         <m:r>
           <m:rPr>
             <m:sty m:val="i"/>
@@ -6612,20 +7155,26 @@
           <m:rPr>
             <m:sty m:val="p"/>
           </m:rPr>
-          <m:t>+</m:t>
-        </m:r>
-        <m:r>
-          <m:rPr>
-            <m:sty m:val="i"/>
-          </m:rPr>
-          <m:t>a</m:t>
-        </m:r>
-        <m:r>
-          <m:rPr>
-            <m:sty m:val="p"/>
-          </m:rPr>
-          <m:t>₂</m:t>
-        </m:r>
+          <m:t>³+</m:t>
+        </m:r>
+        <m:f>
+          <m:num>
+            <m:r>
+              <m:rPr>
+                <m:sty m:val="p"/>
+              </m:rPr>
+              <m:t>5</m:t>
+            </m:r>
+          </m:num>
+          <m:den>
+            <m:r>
+              <m:rPr>
+                <m:sty m:val="p"/>
+              </m:rPr>
+              <m:t>4</m:t>
+            </m:r>
+          </m:den>
+        </m:f>
         <m:r>
           <m:rPr>
             <m:sty m:val="i"/>
@@ -6642,169 +7191,7 @@
           <m:rPr>
             <m:sty m:val="i"/>
           </m:rPr>
-          <m:t>a</m:t>
-        </m:r>
-        <m:r>
-          <m:rPr>
-            <m:sty m:val="p"/>
-          </m:rPr>
-          <m:t>₃</m:t>
-        </m:r>
-        <m:r>
-          <m:rPr>
-            <m:sty m:val="i"/>
-          </m:rPr>
           <m:t>x</m:t>
-        </m:r>
-        <m:r>
-          <m:rPr>
-            <m:sty m:val="p"/>
-          </m:rPr>
-          <m:t>³,  </m:t>
-        </m:r>
-        <m:r>
-          <m:rPr>
-            <m:sty m:val="i"/>
-          </m:rPr>
-          <m:t>p</m:t>
-        </m:r>
-        <m:r>
-          <m:rPr>
-            <m:sty m:val="p"/>
-          </m:rPr>
-          <m:t>(</m:t>
-        </m:r>
-        <m:r>
-          <m:rPr>
-            <m:sty m:val="i"/>
-          </m:rPr>
-          <m:t>x</m:t>
-        </m:r>
-        <m:r>
-          <m:rPr>
-            <m:sty m:val="p"/>
-          </m:rPr>
-          <m:t>₁)=</m:t>
-        </m:r>
-        <m:r>
-          <m:rPr>
-            <m:sty m:val="i"/>
-          </m:rPr>
-          <m:t>y</m:t>
-        </m:r>
-        <m:r>
-          <m:rPr>
-            <m:sty m:val="p"/>
-          </m:rPr>
-          <m:t>₁,  </m:t>
-        </m:r>
-        <m:r>
-          <m:rPr>
-            <m:sty m:val="i"/>
-          </m:rPr>
-          <m:t>p</m:t>
-        </m:r>
-        <m:r>
-          <m:rPr>
-            <m:sty m:val="p"/>
-          </m:rPr>
-          <m:t>′(</m:t>
-        </m:r>
-        <m:r>
-          <m:rPr>
-            <m:sty m:val="i"/>
-          </m:rPr>
-          <m:t>x</m:t>
-        </m:r>
-        <m:r>
-          <m:rPr>
-            <m:sty m:val="p"/>
-          </m:rPr>
-          <m:t>₁)=</m:t>
-        </m:r>
-        <m:r>
-          <m:rPr>
-            <m:sty m:val="i"/>
-          </m:rPr>
-          <m:t>s</m:t>
-        </m:r>
-        <m:r>
-          <m:rPr>
-            <m:sty m:val="p"/>
-          </m:rPr>
-          <m:t>₁,  </m:t>
-        </m:r>
-        <m:r>
-          <m:rPr>
-            <m:sty m:val="i"/>
-          </m:rPr>
-          <m:t>p</m:t>
-        </m:r>
-        <m:r>
-          <m:rPr>
-            <m:sty m:val="p"/>
-          </m:rPr>
-          <m:t>(</m:t>
-        </m:r>
-        <m:r>
-          <m:rPr>
-            <m:sty m:val="i"/>
-          </m:rPr>
-          <m:t>x</m:t>
-        </m:r>
-        <m:r>
-          <m:rPr>
-            <m:sty m:val="p"/>
-          </m:rPr>
-          <m:t>₂)=</m:t>
-        </m:r>
-        <m:r>
-          <m:rPr>
-            <m:sty m:val="i"/>
-          </m:rPr>
-          <m:t>y</m:t>
-        </m:r>
-        <m:r>
-          <m:rPr>
-            <m:sty m:val="p"/>
-          </m:rPr>
-          <m:t>₂,  </m:t>
-        </m:r>
-        <m:r>
-          <m:rPr>
-            <m:sty m:val="i"/>
-          </m:rPr>
-          <m:t>p</m:t>
-        </m:r>
-        <m:r>
-          <m:rPr>
-            <m:sty m:val="p"/>
-          </m:rPr>
-          <m:t>′(</m:t>
-        </m:r>
-        <m:r>
-          <m:rPr>
-            <m:sty m:val="i"/>
-          </m:rPr>
-          <m:t>x</m:t>
-        </m:r>
-        <m:r>
-          <m:rPr>
-            <m:sty m:val="p"/>
-          </m:rPr>
-          <m:t>₂)=</m:t>
-        </m:r>
-        <m:r>
-          <m:rPr>
-            <m:sty m:val="i"/>
-          </m:rPr>
-          <m:t>s</m:t>
-        </m:r>
-        <m:r>
-          <m:rPr>
-            <m:sty m:val="p"/>
-          </m:rPr>
-          <m:t>₂</m:t>
         </m:r>
       </m:oMath>
       <w:r>
@@ -6815,6 +7202,14 @@
         </w:rPr>
         <w:tab/>
         <w:t>(2.16)</w:t>
+      </w:r>
+    </w:p>
+    <w:p>
+      <w:r>
+        <w:rPr>
+          <w:lang w:val="en-US"/>
+        </w:rPr>
+        <w:t>Writing the cubic with four unknown coefficients makes the elimination transparent. The two conditions at zero set the intercept to zero and the linear coefficient to one. The value condition at two then gives eight times the cubic coefficient plus four times the quadratic coefficient equal to one. The derivative condition at two gives twelve times the cubic coefficient plus four times the quadratic coefficient equal to negative one. Subtraction yields the cubic coefficient negative one half, followed by the quadratic coefficient five fourths.</w:t>
       </w:r>
     </w:p>
     <w:p>
@@ -10304,6 +10699,78 @@
         <w:tab/>
       </w:r>
       <m:oMath>
+        <m:f>
+          <m:num>
+            <m:r>
+              <m:rPr>
+                <m:sty m:val="p"/>
+              </m:rPr>
+              <m:t>d</m:t>
+            </m:r>
+          </m:num>
+          <m:den>
+            <m:r>
+              <m:rPr>
+                <m:sty m:val="i"/>
+              </m:rPr>
+              <m:t>d</m:t>
+            </m:r>
+            <m:r>
+              <m:rPr>
+                <m:sty m:val="i"/>
+              </m:rPr>
+              <m:t>x</m:t>
+            </m:r>
+          </m:den>
+        </m:f>
+        <m:r>
+          <m:rPr>
+            <m:sty m:val="p"/>
+          </m:rPr>
+          <m:t>[(</m:t>
+        </m:r>
+        <m:r>
+          <m:rPr>
+            <m:sty m:val="i"/>
+          </m:rPr>
+          <m:t>x</m:t>
+        </m:r>
+        <m:r>
+          <m:rPr>
+            <m:sty m:val="p"/>
+          </m:rPr>
+          <m:t>²+1)(</m:t>
+        </m:r>
+        <m:r>
+          <m:rPr>
+            <m:sty m:val="i"/>
+          </m:rPr>
+          <m:t>x</m:t>
+        </m:r>
+        <m:r>
+          <m:rPr>
+            <m:sty m:val="p"/>
+          </m:rPr>
+          <m:t>³−2</m:t>
+        </m:r>
+        <m:r>
+          <m:rPr>
+            <m:sty m:val="i"/>
+          </m:rPr>
+          <m:t>x</m:t>
+        </m:r>
+        <m:r>
+          <m:rPr>
+            <m:sty m:val="p"/>
+          </m:rPr>
+          <m:t>)]=2</m:t>
+        </m:r>
+        <m:r>
+          <m:rPr>
+            <m:sty m:val="i"/>
+          </m:rPr>
+          <m:t>x</m:t>
+        </m:r>
         <m:r>
           <m:rPr>
             <m:sty m:val="p"/>
@@ -10314,61 +10781,73 @@
           <m:rPr>
             <m:sty m:val="i"/>
           </m:rPr>
-          <m:t>u</m:t>
-        </m:r>
-        <m:r>
-          <m:rPr>
-            <m:sty m:val="i"/>
-          </m:rPr>
-          <m:t>v</m:t>
-        </m:r>
-        <m:r>
-          <m:rPr>
-            <m:sty m:val="p"/>
-          </m:rPr>
-          <m:t>)′=</m:t>
-        </m:r>
-        <m:r>
-          <m:rPr>
-            <m:sty m:val="i"/>
-          </m:rPr>
-          <m:t>u</m:t>
-        </m:r>
-        <m:r>
-          <m:rPr>
-            <m:sty m:val="p"/>
-          </m:rPr>
-          <m:t>′</m:t>
-        </m:r>
-        <m:r>
-          <m:rPr>
-            <m:sty m:val="i"/>
-          </m:rPr>
-          <m:t>v</m:t>
-        </m:r>
-        <m:r>
-          <m:rPr>
-            <m:sty m:val="p"/>
-          </m:rPr>
-          <m:t>+</m:t>
-        </m:r>
-        <m:r>
-          <m:rPr>
-            <m:sty m:val="i"/>
-          </m:rPr>
-          <m:t>u</m:t>
-        </m:r>
-        <m:r>
-          <m:rPr>
-            <m:sty m:val="i"/>
-          </m:rPr>
-          <m:t>v</m:t>
-        </m:r>
-        <m:r>
-          <m:rPr>
-            <m:sty m:val="p"/>
-          </m:rPr>
-          <m:t>′</m:t>
+          <m:t>x</m:t>
+        </m:r>
+        <m:r>
+          <m:rPr>
+            <m:sty m:val="p"/>
+          </m:rPr>
+          <m:t>³−2</m:t>
+        </m:r>
+        <m:r>
+          <m:rPr>
+            <m:sty m:val="i"/>
+          </m:rPr>
+          <m:t>x</m:t>
+        </m:r>
+        <m:r>
+          <m:rPr>
+            <m:sty m:val="p"/>
+          </m:rPr>
+          <m:t>)+(</m:t>
+        </m:r>
+        <m:r>
+          <m:rPr>
+            <m:sty m:val="i"/>
+          </m:rPr>
+          <m:t>x</m:t>
+        </m:r>
+        <m:r>
+          <m:rPr>
+            <m:sty m:val="p"/>
+          </m:rPr>
+          <m:t>²+1)(3</m:t>
+        </m:r>
+        <m:r>
+          <m:rPr>
+            <m:sty m:val="i"/>
+          </m:rPr>
+          <m:t>x</m:t>
+        </m:r>
+        <m:r>
+          <m:rPr>
+            <m:sty m:val="p"/>
+          </m:rPr>
+          <m:t>²−2)=5</m:t>
+        </m:r>
+        <m:r>
+          <m:rPr>
+            <m:sty m:val="i"/>
+          </m:rPr>
+          <m:t>x</m:t>
+        </m:r>
+        <m:r>
+          <m:rPr>
+            <m:sty m:val="p"/>
+          </m:rPr>
+          <m:t>⁴−3</m:t>
+        </m:r>
+        <m:r>
+          <m:rPr>
+            <m:sty m:val="i"/>
+          </m:rPr>
+          <m:t>x</m:t>
+        </m:r>
+        <m:r>
+          <m:rPr>
+            <m:sty m:val="p"/>
+          </m:rPr>
+          <m:t>²−2</m:t>
         </m:r>
       </m:oMath>
       <w:r>
@@ -10379,6 +10858,14 @@
         </w:rPr>
         <w:tab/>
         <w:t>(3.13)</w:t>
+      </w:r>
+    </w:p>
+    <w:p>
+      <w:r>
+        <w:rPr>
+          <w:lang w:val="en-US"/>
+        </w:rPr>
+        <w:t>In the displayed calculation, the first contribution is two times the input multiplied by the cubic factor, and the second contribution is the quadratic factor multiplied by three squared inputs minus two. Expansion gives five fourth-power inputs minus three squared inputs minus two. Differentiating the fully expanded original product gives the same polynomial, so the contribution form and the termwise form verify one another exactly.</w:t>
       </w:r>
     </w:p>
     <w:p>
@@ -10458,25 +10945,13 @@
               <m:rPr>
                 <m:sty m:val="i"/>
               </m:rPr>
-              <m:t>p</m:t>
+              <m:t>x</m:t>
             </m:r>
             <m:r>
               <m:rPr>
                 <m:sty m:val="p"/>
               </m:rPr>
-              <m:t>(</m:t>
-            </m:r>
-            <m:r>
-              <m:rPr>
-                <m:sty m:val="i"/>
-              </m:rPr>
-              <m:t>x</m:t>
-            </m:r>
-            <m:r>
-              <m:rPr>
-                <m:sty m:val="p"/>
-              </m:rPr>
-              <m:t>)</m:t>
+              <m:t>²+1</m:t>
             </m:r>
           </m:num>
           <m:den>
@@ -10484,25 +10959,13 @@
               <m:rPr>
                 <m:sty m:val="i"/>
               </m:rPr>
-              <m:t>q</m:t>
+              <m:t>x</m:t>
             </m:r>
             <m:r>
               <m:rPr>
                 <m:sty m:val="p"/>
               </m:rPr>
-              <m:t>(</m:t>
-            </m:r>
-            <m:r>
-              <m:rPr>
-                <m:sty m:val="i"/>
-              </m:rPr>
-              <m:t>x</m:t>
-            </m:r>
-            <m:r>
-              <m:rPr>
-                <m:sty m:val="p"/>
-              </m:rPr>
-              <m:t>)</m:t>
+              <m:t>−1</m:t>
             </m:r>
           </m:den>
         </m:f>
@@ -10542,13 +11005,13 @@
               <m:rPr>
                 <m:sty m:val="i"/>
               </m:rPr>
-              <m:t>q</m:t>
+              <m:t>x</m:t>
             </m:r>
             <m:r>
               <m:rPr>
                 <m:sty m:val="p"/>
               </m:rPr>
-              <m:t>(</m:t>
+              <m:t>²−2</m:t>
             </m:r>
             <m:r>
               <m:rPr>
@@ -10560,108 +11023,72 @@
               <m:rPr>
                 <m:sty m:val="p"/>
               </m:rPr>
-              <m:t>)</m:t>
-            </m:r>
-            <m:r>
-              <m:rPr>
-                <m:sty m:val="i"/>
-              </m:rPr>
-              <m:t>p</m:t>
-            </m:r>
-            <m:r>
-              <m:rPr>
-                <m:sty m:val="p"/>
-              </m:rPr>
-              <m:t>′(</m:t>
-            </m:r>
-            <m:r>
-              <m:rPr>
-                <m:sty m:val="i"/>
-              </m:rPr>
-              <m:t>x</m:t>
-            </m:r>
-            <m:r>
-              <m:rPr>
-                <m:sty m:val="p"/>
-              </m:rPr>
-              <m:t>)−</m:t>
-            </m:r>
-            <m:r>
-              <m:rPr>
-                <m:sty m:val="i"/>
-              </m:rPr>
-              <m:t>p</m:t>
-            </m:r>
-            <m:r>
-              <m:rPr>
-                <m:sty m:val="p"/>
-              </m:rPr>
-              <m:t>(</m:t>
-            </m:r>
-            <m:r>
-              <m:rPr>
-                <m:sty m:val="i"/>
-              </m:rPr>
-              <m:t>x</m:t>
-            </m:r>
-            <m:r>
-              <m:rPr>
-                <m:sty m:val="p"/>
-              </m:rPr>
-              <m:t>)</m:t>
-            </m:r>
-            <m:r>
-              <m:rPr>
-                <m:sty m:val="i"/>
-              </m:rPr>
-              <m:t>q</m:t>
-            </m:r>
-            <m:r>
-              <m:rPr>
-                <m:sty m:val="p"/>
-              </m:rPr>
-              <m:t>′(</m:t>
-            </m:r>
-            <m:r>
-              <m:rPr>
-                <m:sty m:val="i"/>
-              </m:rPr>
-              <m:t>x</m:t>
-            </m:r>
-            <m:r>
-              <m:rPr>
-                <m:sty m:val="p"/>
-              </m:rPr>
-              <m:t>)</m:t>
+              <m:t>−1</m:t>
             </m:r>
           </m:num>
           <m:den>
             <m:r>
               <m:rPr>
+                <m:sty m:val="p"/>
+              </m:rPr>
+              <m:t>(</m:t>
+            </m:r>
+            <m:r>
+              <m:rPr>
                 <m:sty m:val="i"/>
               </m:rPr>
-              <m:t>q</m:t>
+              <m:t>x</m:t>
             </m:r>
             <m:r>
               <m:rPr>
                 <m:sty m:val="p"/>
               </m:rPr>
-              <m:t>(</m:t>
-            </m:r>
-            <m:r>
-              <m:rPr>
-                <m:sty m:val="i"/>
-              </m:rPr>
-              <m:t>x</m:t>
-            </m:r>
-            <m:r>
-              <m:rPr>
-                <m:sty m:val="p"/>
-              </m:rPr>
-              <m:t>)²</m:t>
+              <m:t>−1)²</m:t>
             </m:r>
           </m:den>
         </m:f>
+        <m:r>
+          <m:rPr>
+            <m:sty m:val="p"/>
+          </m:rPr>
+          <m:t>;  </m:t>
+        </m:r>
+        <m:r>
+          <m:rPr>
+            <m:sty m:val="i"/>
+          </m:rPr>
+          <m:t>r</m:t>
+        </m:r>
+        <m:r>
+          <m:rPr>
+            <m:sty m:val="p"/>
+          </m:rPr>
+          <m:t>′(</m:t>
+        </m:r>
+        <m:r>
+          <m:rPr>
+            <m:sty m:val="i"/>
+          </m:rPr>
+          <m:t>x</m:t>
+        </m:r>
+        <m:r>
+          <m:rPr>
+            <m:sty m:val="p"/>
+          </m:rPr>
+          <m:t>)=0  ⇒  </m:t>
+        </m:r>
+        <m:r>
+          <m:rPr>
+            <m:sty m:val="i"/>
+          </m:rPr>
+          <m:t>x</m:t>
+        </m:r>
+        <m:r>
+          <m:rPr>
+            <m:sty m:val="p"/>
+          </m:rPr>
+          <m:t>=1±√2</m:t>
+        </m:r>
       </m:oMath>
       <w:r>
         <w:rPr>
@@ -10671,6 +11098,14 @@
         </w:rPr>
         <w:tab/>
         <w:t>(3.14)</w:t>
+      </w:r>
+    </w:p>
+    <w:p>
+      <w:r>
+        <w:rPr>
+          <w:lang w:val="en-US"/>
+        </w:rPr>
+        <w:t>For the stated rational function, assembling and simplifying the quotient numerator gives the quadratic expression shown. Setting that numerator equal to zero produces the two candidates one plus or minus the square root of two. Neither candidate equals the excluded input one, so both are valid stationary inputs of the original rational function. The denominator square remains positive at both points, confirming that no additional sign ambiguity was introduced.</w:t>
       </w:r>
     </w:p>
     <w:p>
@@ -10736,7 +11171,7 @@
           <m:rPr>
             <m:sty m:val="i"/>
           </m:rPr>
-          <m:t>a</m:t>
+          <m:t>x</m:t>
         </m:r>
         <m:r>
           <m:rPr>
@@ -10755,46 +11190,40 @@
             <m:sty m:val="p"/>
           </m:rPr>
           <m:t>)=</m:t>
-        </m:r>
-        <m:r>
-          <m:rPr>
-            <m:sty m:val="i"/>
-          </m:rPr>
-          <m:t>R</m:t>
-        </m:r>
-        <m:r>
-          <m:rPr>
-            <m:sty m:val="p"/>
-          </m:rPr>
-          <m:t>,  </m:t>
         </m:r>
         <m:f>
           <m:num>
             <m:r>
               <m:rPr>
+                <m:sty m:val="i"/>
+              </m:rPr>
+              <m:t>x</m:t>
+            </m:r>
+            <m:r>
+              <m:rPr>
                 <m:sty m:val="p"/>
               </m:rPr>
-              <m:t>∂</m:t>
+              <m:t>²+</m:t>
             </m:r>
             <m:r>
               <m:rPr>
                 <m:sty m:val="i"/>
               </m:rPr>
-              <m:t>r</m:t>
+              <m:t>k</m:t>
             </m:r>
           </m:num>
           <m:den>
             <m:r>
               <m:rPr>
+                <m:sty m:val="i"/>
+              </m:rPr>
+              <m:t>x</m:t>
+            </m:r>
+            <m:r>
+              <m:rPr>
                 <m:sty m:val="p"/>
               </m:rPr>
-              <m:t>∂</m:t>
-            </m:r>
-            <m:r>
-              <m:rPr>
-                <m:sty m:val="i"/>
-              </m:rPr>
-              <m:t>x</m:t>
+              <m:t>+1</m:t>
             </m:r>
           </m:den>
         </m:f>
@@ -10802,19 +11231,19 @@
           <m:rPr>
             <m:sty m:val="p"/>
           </m:rPr>
-          <m:t>(</m:t>
-        </m:r>
-        <m:r>
-          <m:rPr>
-            <m:sty m:val="i"/>
-          </m:rPr>
-          <m:t>a</m:t>
-        </m:r>
-        <m:r>
-          <m:rPr>
-            <m:sty m:val="p"/>
-          </m:rPr>
-          <m:t>;</m:t>
+          <m:t>;  </m:t>
+        </m:r>
+        <m:r>
+          <m:rPr>
+            <m:sty m:val="i"/>
+          </m:rPr>
+          <m:t>r</m:t>
+        </m:r>
+        <m:r>
+          <m:rPr>
+            <m:sty m:val="p"/>
+          </m:rPr>
+          <m:t>(1;</m:t>
         </m:r>
         <m:r>
           <m:rPr>
@@ -10826,13 +11255,43 @@
           <m:rPr>
             <m:sty m:val="p"/>
           </m:rPr>
-          <m:t>)=</m:t>
-        </m:r>
-        <m:r>
-          <m:rPr>
-            <m:sty m:val="i"/>
-          </m:rPr>
-          <m:t>S</m:t>
+          <m:t>)=2, </m:t>
+        </m:r>
+        <m:r>
+          <m:rPr>
+            <m:sty m:val="i"/>
+          </m:rPr>
+          <m:t>r</m:t>
+        </m:r>
+        <m:r>
+          <m:rPr>
+            <m:sty m:val="p"/>
+          </m:rPr>
+          <m:t>′(1;</m:t>
+        </m:r>
+        <m:r>
+          <m:rPr>
+            <m:sty m:val="i"/>
+          </m:rPr>
+          <m:t>k</m:t>
+        </m:r>
+        <m:r>
+          <m:rPr>
+            <m:sty m:val="p"/>
+          </m:rPr>
+          <m:t>)=0  ⇒  </m:t>
+        </m:r>
+        <m:r>
+          <m:rPr>
+            <m:sty m:val="i"/>
+          </m:rPr>
+          <m:t>k</m:t>
+        </m:r>
+        <m:r>
+          <m:rPr>
+            <m:sty m:val="p"/>
+          </m:rPr>
+          <m:t>=3</m:t>
         </m:r>
       </m:oMath>
       <w:r>
@@ -10843,6 +11302,53 @@
         </w:rPr>
         <w:tab/>
         <w:t>(3.15)</w:t>
+      </w:r>
+    </w:p>
+    <w:p>
+      <w:r>
+        <w:rPr>
+          <w:lang w:val="en-US"/>
+        </w:rPr>
+        <w:t xml:space="preserve">The value condition at one gives one plus </w:t>
+      </w:r>
+      <w:r>
+        <w:rPr>
+          <w:i/>
+          <w:lang w:val="en-US"/>
+        </w:rPr>
+        <w:t>k</w:t>
+      </w:r>
+      <w:r>
+        <w:rPr>
+          <w:lang w:val="en-US"/>
+        </w:rPr>
+        <w:t xml:space="preserve"> divided by two equal to two, so </w:t>
+      </w:r>
+      <w:r>
+        <w:rPr>
+          <w:i/>
+          <w:lang w:val="en-US"/>
+        </w:rPr>
+        <w:t>k</w:t>
+      </w:r>
+      <w:r>
+        <w:rPr>
+          <w:lang w:val="en-US"/>
+        </w:rPr>
+        <w:t xml:space="preserve"> must equal three. The quotient derivative at one simplifies to three minus </w:t>
+      </w:r>
+      <w:r>
+        <w:rPr>
+          <w:i/>
+          <w:lang w:val="en-US"/>
+        </w:rPr>
+        <w:t>k</w:t>
+      </w:r>
+      <w:r>
+        <w:rPr>
+          <w:lang w:val="en-US"/>
+        </w:rPr>
+        <w:t xml:space="preserve"> divided by four, which becomes zero for the same parameter. The two requirements are therefore compatible, and direct substitution verifies both the normalized performance level and its stationary local response.</w:t>
       </w:r>
     </w:p>
     <w:p>
@@ -15277,13 +15783,61 @@
           <m:rPr>
             <m:sty m:val="p"/>
           </m:rPr>
-          <m:t>[</m:t>
-        </m:r>
-        <m:r>
-          <m:rPr>
-            <m:sty m:val="i"/>
-          </m:rPr>
-          <m:t>p</m:t>
+          <m:t>[(</m:t>
+        </m:r>
+        <m:r>
+          <m:rPr>
+            <m:sty m:val="i"/>
+          </m:rPr>
+          <m:t>x</m:t>
+        </m:r>
+        <m:r>
+          <m:rPr>
+            <m:sty m:val="p"/>
+          </m:rPr>
+          <m:t>²+1)(</m:t>
+        </m:r>
+        <m:r>
+          <m:rPr>
+            <m:sty m:val="i"/>
+          </m:rPr>
+          <m:t>x</m:t>
+        </m:r>
+        <m:r>
+          <m:rPr>
+            <m:sty m:val="p"/>
+          </m:rPr>
+          <m:t>−2)]³=3[(</m:t>
+        </m:r>
+        <m:r>
+          <m:rPr>
+            <m:sty m:val="i"/>
+          </m:rPr>
+          <m:t>x</m:t>
+        </m:r>
+        <m:r>
+          <m:rPr>
+            <m:sty m:val="p"/>
+          </m:rPr>
+          <m:t>²+1)(</m:t>
+        </m:r>
+        <m:r>
+          <m:rPr>
+            <m:sty m:val="i"/>
+          </m:rPr>
+          <m:t>x</m:t>
+        </m:r>
+        <m:r>
+          <m:rPr>
+            <m:sty m:val="p"/>
+          </m:rPr>
+          <m:t>−2)]²[2</m:t>
+        </m:r>
+        <m:r>
+          <m:rPr>
+            <m:sty m:val="i"/>
+          </m:rPr>
+          <m:t>x</m:t>
         </m:r>
         <m:r>
           <m:rPr>
@@ -15301,19 +15855,7 @@
           <m:rPr>
             <m:sty m:val="p"/>
           </m:rPr>
-          <m:t>)</m:t>
-        </m:r>
-        <m:r>
-          <m:rPr>
-            <m:sty m:val="i"/>
-          </m:rPr>
-          <m:t>q</m:t>
-        </m:r>
-        <m:r>
-          <m:rPr>
-            <m:sty m:val="p"/>
-          </m:rPr>
-          <m:t>(</m:t>
+          <m:t>−2)+(</m:t>
         </m:r>
         <m:r>
           <m:rPr>
@@ -15325,151 +15867,7 @@
           <m:rPr>
             <m:sty m:val="p"/>
           </m:rPr>
-          <m:t>)]³=3[</m:t>
-        </m:r>
-        <m:r>
-          <m:rPr>
-            <m:sty m:val="i"/>
-          </m:rPr>
-          <m:t>p</m:t>
-        </m:r>
-        <m:r>
-          <m:rPr>
-            <m:sty m:val="p"/>
-          </m:rPr>
-          <m:t>(</m:t>
-        </m:r>
-        <m:r>
-          <m:rPr>
-            <m:sty m:val="i"/>
-          </m:rPr>
-          <m:t>x</m:t>
-        </m:r>
-        <m:r>
-          <m:rPr>
-            <m:sty m:val="p"/>
-          </m:rPr>
-          <m:t>)</m:t>
-        </m:r>
-        <m:r>
-          <m:rPr>
-            <m:sty m:val="i"/>
-          </m:rPr>
-          <m:t>q</m:t>
-        </m:r>
-        <m:r>
-          <m:rPr>
-            <m:sty m:val="p"/>
-          </m:rPr>
-          <m:t>(</m:t>
-        </m:r>
-        <m:r>
-          <m:rPr>
-            <m:sty m:val="i"/>
-          </m:rPr>
-          <m:t>x</m:t>
-        </m:r>
-        <m:r>
-          <m:rPr>
-            <m:sty m:val="p"/>
-          </m:rPr>
-          <m:t>)]²[</m:t>
-        </m:r>
-        <m:r>
-          <m:rPr>
-            <m:sty m:val="i"/>
-          </m:rPr>
-          <m:t>p</m:t>
-        </m:r>
-        <m:r>
-          <m:rPr>
-            <m:sty m:val="p"/>
-          </m:rPr>
-          <m:t>′(</m:t>
-        </m:r>
-        <m:r>
-          <m:rPr>
-            <m:sty m:val="i"/>
-          </m:rPr>
-          <m:t>x</m:t>
-        </m:r>
-        <m:r>
-          <m:rPr>
-            <m:sty m:val="p"/>
-          </m:rPr>
-          <m:t>)</m:t>
-        </m:r>
-        <m:r>
-          <m:rPr>
-            <m:sty m:val="i"/>
-          </m:rPr>
-          <m:t>q</m:t>
-        </m:r>
-        <m:r>
-          <m:rPr>
-            <m:sty m:val="p"/>
-          </m:rPr>
-          <m:t>(</m:t>
-        </m:r>
-        <m:r>
-          <m:rPr>
-            <m:sty m:val="i"/>
-          </m:rPr>
-          <m:t>x</m:t>
-        </m:r>
-        <m:r>
-          <m:rPr>
-            <m:sty m:val="p"/>
-          </m:rPr>
-          <m:t>)+</m:t>
-        </m:r>
-        <m:r>
-          <m:rPr>
-            <m:sty m:val="i"/>
-          </m:rPr>
-          <m:t>p</m:t>
-        </m:r>
-        <m:r>
-          <m:rPr>
-            <m:sty m:val="p"/>
-          </m:rPr>
-          <m:t>(</m:t>
-        </m:r>
-        <m:r>
-          <m:rPr>
-            <m:sty m:val="i"/>
-          </m:rPr>
-          <m:t>x</m:t>
-        </m:r>
-        <m:r>
-          <m:rPr>
-            <m:sty m:val="p"/>
-          </m:rPr>
-          <m:t>)</m:t>
-        </m:r>
-        <m:r>
-          <m:rPr>
-            <m:sty m:val="i"/>
-          </m:rPr>
-          <m:t>q</m:t>
-        </m:r>
-        <m:r>
-          <m:rPr>
-            <m:sty m:val="p"/>
-          </m:rPr>
-          <m:t>′(</m:t>
-        </m:r>
-        <m:r>
-          <m:rPr>
-            <m:sty m:val="i"/>
-          </m:rPr>
-          <m:t>x</m:t>
-        </m:r>
-        <m:r>
-          <m:rPr>
-            <m:sty m:val="p"/>
-          </m:rPr>
-          <m:t>)]</m:t>
+          <m:t>²+1)]</m:t>
         </m:r>
       </m:oMath>
       <w:r>
@@ -15480,6 +15878,14 @@
         </w:rPr>
         <w:tab/>
         <w:t>(4.13)</w:t>
+      </w:r>
+    </w:p>
+    <w:p>
+      <w:r>
+        <w:rPr>
+          <w:lang w:val="en-US"/>
+        </w:rPr>
+        <w:t>For the displayed function, the outer cubic contributes three times the inner product squared. The derivative of the inner product contains two times the input multiplied by the linear factor, plus the quadratic factor multiplied by one. Multiplying those pieces gives the factored result shown. An end-to-end central difference can check the entire derivative without expanding a high-degree polynomial.</w:t>
       </w:r>
     </w:p>
     <w:p>
@@ -15533,6 +15939,48 @@
           <m:rPr>
             <m:sty m:val="i"/>
           </m:rPr>
+          <m:t>V</m:t>
+        </m:r>
+        <m:r>
+          <m:rPr>
+            <m:sty m:val="p"/>
+          </m:rPr>
+          <m:t>(</m:t>
+        </m:r>
+        <m:r>
+          <m:rPr>
+            <m:sty m:val="i"/>
+          </m:rPr>
+          <m:t>T</m:t>
+        </m:r>
+        <m:r>
+          <m:rPr>
+            <m:sty m:val="p"/>
+          </m:rPr>
+          <m:t>)=</m:t>
+        </m:r>
+        <m:r>
+          <m:rPr>
+            <m:sty m:val="i"/>
+          </m:rPr>
+          <m:t>g</m:t>
+        </m:r>
+        <m:r>
+          <m:rPr>
+            <m:sty m:val="i"/>
+          </m:rPr>
+          <m:t>T</m:t>
+        </m:r>
+        <m:r>
+          <m:rPr>
+            <m:sty m:val="p"/>
+          </m:rPr>
+          <m:t>, </m:t>
+        </m:r>
+        <m:r>
+          <m:rPr>
+            <m:sty m:val="i"/>
+          </m:rPr>
           <m:t>C</m:t>
         </m:r>
         <m:r>
@@ -15545,43 +15993,163 @@
           <m:rPr>
             <m:sty m:val="i"/>
           </m:rPr>
+          <m:t>V</m:t>
+        </m:r>
+        <m:r>
+          <m:rPr>
+            <m:sty m:val="p"/>
+          </m:rPr>
+          <m:t>)=</m:t>
+        </m:r>
+        <m:r>
+          <m:rPr>
+            <m:sty m:val="i"/>
+          </m:rPr>
+          <m:t>V</m:t>
+        </m:r>
+        <m:r>
+          <m:rPr>
+            <m:sty m:val="p"/>
+          </m:rPr>
+          <m:t>²+1;  </m:t>
+        </m:r>
+        <m:r>
+          <m:rPr>
+            <m:sty m:val="i"/>
+          </m:rPr>
+          <m:t>C</m:t>
+        </m:r>
+        <m:r>
+          <m:rPr>
+            <m:sty m:val="p"/>
+          </m:rPr>
+          <m:t>(</m:t>
+        </m:r>
+        <m:r>
+          <m:rPr>
+            <m:sty m:val="i"/>
+          </m:rPr>
+          <m:t>V</m:t>
+        </m:r>
+        <m:r>
+          <m:rPr>
+            <m:sty m:val="p"/>
+          </m:rPr>
+          <m:t>(2))=17, </m:t>
+        </m:r>
+        <m:f>
+          <m:num>
+            <m:r>
+              <m:rPr>
+                <m:sty m:val="i"/>
+              </m:rPr>
+              <m:t>d</m:t>
+            </m:r>
+            <m:r>
+              <m:rPr>
+                <m:sty m:val="i"/>
+              </m:rPr>
+              <m:t>C</m:t>
+            </m:r>
+          </m:num>
+          <m:den>
+            <m:r>
+              <m:rPr>
+                <m:sty m:val="i"/>
+              </m:rPr>
+              <m:t>d</m:t>
+            </m:r>
+            <m:r>
+              <m:rPr>
+                <m:sty m:val="i"/>
+              </m:rPr>
+              <m:t>T</m:t>
+            </m:r>
+          </m:den>
+        </m:f>
+        <m:r>
+          <m:rPr>
+            <m:sty m:val="p"/>
+          </m:rPr>
+          <m:t>(2)=16  ⇒  </m:t>
+        </m:r>
+        <m:r>
+          <m:rPr>
+            <m:sty m:val="i"/>
+          </m:rPr>
           <m:t>g</m:t>
         </m:r>
         <m:r>
           <m:rPr>
-            <m:sty m:val="i"/>
-          </m:rPr>
-          <m:t>x</m:t>
-        </m:r>
-        <m:r>
-          <m:rPr>
-            <m:sty m:val="p"/>
-          </m:rPr>
-          <m:t>₀)=</m:t>
-        </m:r>
-        <m:r>
-          <m:rPr>
-            <m:sty m:val="i"/>
-          </m:rPr>
-          <m:t>C</m:t>
-        </m:r>
-        <m:r>
-          <m:rPr>
-            <m:sty m:val="p"/>
-          </m:rPr>
-          <m:t>₀,  </m:t>
-        </m:r>
-        <m:r>
-          <m:rPr>
-            <m:sty m:val="i"/>
-          </m:rPr>
-          <m:t>C</m:t>
-        </m:r>
-        <m:r>
-          <m:rPr>
-            <m:sty m:val="p"/>
-          </m:rPr>
-          <m:t>′(</m:t>
+            <m:sty m:val="p"/>
+          </m:rPr>
+          <m:t>=2  </m:t>
+        </m:r>
+        <m:r>
+          <m:rPr>
+            <m:sty m:val="p"/>
+          </m:rPr>
+          <m:t>for</m:t>
+        </m:r>
+        <m:r>
+          <m:rPr>
+            <m:sty m:val="p"/>
+          </m:rPr>
+          <m:t> </m:t>
+        </m:r>
+        <m:r>
+          <m:rPr>
+            <m:sty m:val="i"/>
+          </m:rPr>
+          <m:t>p</m:t>
+        </m:r>
+        <m:r>
+          <m:rPr>
+            <m:sty m:val="i"/>
+          </m:rPr>
+          <m:t>o</m:t>
+        </m:r>
+        <m:r>
+          <m:rPr>
+            <m:sty m:val="i"/>
+          </m:rPr>
+          <m:t>s</m:t>
+        </m:r>
+        <m:r>
+          <m:rPr>
+            <m:sty m:val="i"/>
+          </m:rPr>
+          <m:t>i</m:t>
+        </m:r>
+        <m:r>
+          <m:rPr>
+            <m:sty m:val="i"/>
+          </m:rPr>
+          <m:t>t</m:t>
+        </m:r>
+        <m:r>
+          <m:rPr>
+            <m:sty m:val="i"/>
+          </m:rPr>
+          <m:t>i</m:t>
+        </m:r>
+        <m:r>
+          <m:rPr>
+            <m:sty m:val="i"/>
+          </m:rPr>
+          <m:t>v</m:t>
+        </m:r>
+        <m:r>
+          <m:rPr>
+            <m:sty m:val="i"/>
+          </m:rPr>
+          <m:t>e</m:t>
+        </m:r>
+        <m:r>
+          <m:rPr>
+            <m:sty m:val="p"/>
+          </m:rPr>
+          <m:t> </m:t>
         </m:r>
         <m:r>
           <m:rPr>
@@ -15593,37 +16161,19 @@
           <m:rPr>
             <m:sty m:val="i"/>
           </m:rPr>
-          <m:t>x</m:t>
-        </m:r>
-        <m:r>
-          <m:rPr>
-            <m:sty m:val="p"/>
-          </m:rPr>
-          <m:t>₀)</m:t>
-        </m:r>
-        <m:r>
-          <m:rPr>
-            <m:sty m:val="i"/>
-          </m:rPr>
-          <m:t>g</m:t>
-        </m:r>
-        <m:r>
-          <m:rPr>
-            <m:sty m:val="p"/>
-          </m:rPr>
-          <m:t>=</m:t>
-        </m:r>
-        <m:r>
-          <m:rPr>
-            <m:sty m:val="i"/>
-          </m:rPr>
-          <m:t>S</m:t>
-        </m:r>
-        <m:r>
-          <m:rPr>
-            <m:sty m:val="p"/>
-          </m:rPr>
-          <m:t>₀</m:t>
+          <m:t>a</m:t>
+        </m:r>
+        <m:r>
+          <m:rPr>
+            <m:sty m:val="i"/>
+          </m:rPr>
+          <m:t>i</m:t>
+        </m:r>
+        <m:r>
+          <m:rPr>
+            <m:sty m:val="i"/>
+          </m:rPr>
+          <m:t>n</m:t>
         </m:r>
       </m:oMath>
       <w:r>
@@ -15634,6 +16184,53 @@
         </w:rPr>
         <w:tab/>
         <w:t>(4.14)</w:t>
+      </w:r>
+    </w:p>
+    <w:p>
+      <w:r>
+        <w:rPr>
+          <w:lang w:val="en-US"/>
+        </w:rPr>
+        <w:t xml:space="preserve">At the operating temperature two, the inner voltage equals two </w:t>
+      </w:r>
+      <w:r>
+        <w:rPr>
+          <w:i/>
+          <w:lang w:val="en-US"/>
+        </w:rPr>
+        <w:t>g</w:t>
+      </w:r>
+      <w:r>
+        <w:rPr>
+          <w:lang w:val="en-US"/>
+        </w:rPr>
+        <w:t xml:space="preserve">. The required final output therefore gives four times the square of the gain plus one equal to seventeen, so the gain magnitude is two. The chain derivative equals twice the voltage multiplied by </w:t>
+      </w:r>
+      <w:r>
+        <w:rPr>
+          <w:i/>
+          <w:lang w:val="en-US"/>
+        </w:rPr>
+        <w:t>g</w:t>
+      </w:r>
+      <w:r>
+        <w:rPr>
+          <w:lang w:val="en-US"/>
+        </w:rPr>
+        <w:t xml:space="preserve">, which becomes four times the square of the gain and therefore sixteen for either sign. If the conditioner specification requires positive gain, the admissible design is </w:t>
+      </w:r>
+      <w:r>
+        <w:rPr>
+          <w:i/>
+          <w:lang w:val="en-US"/>
+        </w:rPr>
+        <w:t>g</w:t>
+      </w:r>
+      <w:r>
+        <w:rPr>
+          <w:lang w:val="en-US"/>
+        </w:rPr>
+        <w:t xml:space="preserve"> equal to two; the negative candidate is rejected by that engineering constraint rather than by the calculus.</w:t>
       </w:r>
     </w:p>
     <w:p>

</xml_diff>

<commit_message>
Add interactive Session 1 contents navigation
</commit_message>
<xml_diff>
--- a/EN/KDP/MATH_02_EN.docx
+++ b/EN/KDP/MATH_02_EN.docx
@@ -269,38 +269,394 @@
         <w:fldChar w:fldCharType="separate"/>
       </w:r>
       <w:r>
-        <w:rPr>
-          <w:i/>
-          <w:color w:val="595959"/>
-          <w:lang w:val="en-US"/>
-        </w:rPr>
-        <w:t>Update this field in Word to display the interactive contents list.</w:t>
-      </w:r>
-      <w:r>
         <w:fldChar w:fldCharType="end"/>
       </w:r>
     </w:p>
     <w:p>
       <w:pPr>
+        <w:spacing w:after="40"/>
+        <w:ind w:left="0"/>
+      </w:pPr>
+      <w:hyperlink w:anchor="chapter_1">
+        <w:r>
+          <w:rPr>
+            <w:color w:val="0563C1"/>
+            <w:u w:val="single"/>
+          </w:rPr>
+          <w:t>Chapter 1 Foundations of the Derivative and the Difference Quotient</w:t>
+        </w:r>
+      </w:hyperlink>
+    </w:p>
+    <w:p>
+      <w:pPr>
+        <w:spacing w:after="40"/>
+        <w:ind w:left="403"/>
+      </w:pPr>
+      <w:hyperlink w:anchor="section_1_0">
+        <w:r>
+          <w:rPr>
+            <w:color w:val="0563C1"/>
+            <w:u w:val="single"/>
+          </w:rPr>
+          <w:t>1.0 Learning Objectives</w:t>
+        </w:r>
+      </w:hyperlink>
+    </w:p>
+    <w:p>
+      <w:pPr>
+        <w:spacing w:after="40"/>
+        <w:ind w:left="403"/>
+      </w:pPr>
+      <w:hyperlink w:anchor="section_1_1">
+        <w:r>
+          <w:rPr>
+            <w:color w:val="0563C1"/>
+            <w:u w:val="single"/>
+          </w:rPr>
+          <w:t>1.1 Core Theory and Derivation</w:t>
+        </w:r>
+      </w:hyperlink>
+    </w:p>
+    <w:p>
+      <w:pPr>
+        <w:spacing w:after="40"/>
+        <w:ind w:left="403"/>
+      </w:pPr>
+      <w:hyperlink w:anchor="section_1_2">
+        <w:r>
+          <w:rPr>
+            <w:color w:val="0563C1"/>
+            <w:u w:val="single"/>
+          </w:rPr>
+          <w:t>1.2 Real-World Application Box</w:t>
+        </w:r>
+      </w:hyperlink>
+    </w:p>
+    <w:p>
+      <w:pPr>
+        <w:spacing w:after="40"/>
+        <w:ind w:left="403"/>
+      </w:pPr>
+      <w:hyperlink w:anchor="section_1_3">
+        <w:r>
+          <w:rPr>
+            <w:color w:val="0563C1"/>
+            <w:u w:val="single"/>
+          </w:rPr>
+          <w:t>1.3 Tiered Worked Examples</w:t>
+        </w:r>
+      </w:hyperlink>
+    </w:p>
+    <w:p>
+      <w:pPr>
+        <w:spacing w:after="40"/>
+        <w:ind w:left="403"/>
+      </w:pPr>
+      <w:hyperlink w:anchor="section_1_4">
+        <w:r>
+          <w:rPr>
+            <w:color w:val="0563C1"/>
+            <w:u w:val="single"/>
+          </w:rPr>
+          <w:t>1.4 Formula Summary</w:t>
+        </w:r>
+      </w:hyperlink>
+    </w:p>
+    <w:p>
+      <w:pPr>
+        <w:spacing w:after="40"/>
+        <w:ind w:left="0"/>
+      </w:pPr>
+      <w:hyperlink w:anchor="chapter_2">
+        <w:r>
+          <w:rPr>
+            <w:color w:val="0563C1"/>
+            <w:u w:val="single"/>
+          </w:rPr>
+          <w:t>Chapter 2 Basic Differentiation Theorems, Constant, Power, and Sum Rules</w:t>
+        </w:r>
+      </w:hyperlink>
+    </w:p>
+    <w:p>
+      <w:pPr>
+        <w:spacing w:after="40"/>
+        <w:ind w:left="403"/>
+      </w:pPr>
+      <w:hyperlink w:anchor="section_2_0">
+        <w:r>
+          <w:rPr>
+            <w:color w:val="0563C1"/>
+            <w:u w:val="single"/>
+          </w:rPr>
+          <w:t>2.0 Learning Objectives</w:t>
+        </w:r>
+      </w:hyperlink>
+    </w:p>
+    <w:p>
+      <w:pPr>
+        <w:spacing w:after="40"/>
+        <w:ind w:left="403"/>
+      </w:pPr>
+      <w:hyperlink w:anchor="section_2_1">
+        <w:r>
+          <w:rPr>
+            <w:color w:val="0563C1"/>
+            <w:u w:val="single"/>
+          </w:rPr>
+          <w:t>2.1 Core Theory and Derivation</w:t>
+        </w:r>
+      </w:hyperlink>
+    </w:p>
+    <w:p>
+      <w:pPr>
+        <w:spacing w:after="40"/>
+        <w:ind w:left="403"/>
+      </w:pPr>
+      <w:hyperlink w:anchor="section_2_2">
+        <w:r>
+          <w:rPr>
+            <w:color w:val="0563C1"/>
+            <w:u w:val="single"/>
+          </w:rPr>
+          <w:t>2.2 Real-World Application Box</w:t>
+        </w:r>
+      </w:hyperlink>
+    </w:p>
+    <w:p>
+      <w:pPr>
+        <w:spacing w:after="40"/>
+        <w:ind w:left="403"/>
+      </w:pPr>
+      <w:hyperlink w:anchor="section_2_3">
+        <w:r>
+          <w:rPr>
+            <w:color w:val="0563C1"/>
+            <w:u w:val="single"/>
+          </w:rPr>
+          <w:t>2.3 Tiered Worked Examples</w:t>
+        </w:r>
+      </w:hyperlink>
+    </w:p>
+    <w:p>
+      <w:pPr>
+        <w:spacing w:after="40"/>
+        <w:ind w:left="403"/>
+      </w:pPr>
+      <w:hyperlink w:anchor="section_2_4">
+        <w:r>
+          <w:rPr>
+            <w:color w:val="0563C1"/>
+            <w:u w:val="single"/>
+          </w:rPr>
+          <w:t>2.4 Formula Summary</w:t>
+        </w:r>
+      </w:hyperlink>
+    </w:p>
+    <w:p>
+      <w:pPr>
+        <w:spacing w:after="40"/>
+        <w:ind w:left="0"/>
+      </w:pPr>
+      <w:hyperlink w:anchor="chapter_3">
+        <w:r>
+          <w:rPr>
+            <w:color w:val="0563C1"/>
+            <w:u w:val="single"/>
+          </w:rPr>
+          <w:t>Chapter 3 The Product and Quotient Rules</w:t>
+        </w:r>
+      </w:hyperlink>
+    </w:p>
+    <w:p>
+      <w:pPr>
+        <w:spacing w:after="40"/>
+        <w:ind w:left="403"/>
+      </w:pPr>
+      <w:hyperlink w:anchor="section_3_0">
+        <w:r>
+          <w:rPr>
+            <w:color w:val="0563C1"/>
+            <w:u w:val="single"/>
+          </w:rPr>
+          <w:t>3.0 Learning Objectives</w:t>
+        </w:r>
+      </w:hyperlink>
+    </w:p>
+    <w:p>
+      <w:pPr>
+        <w:spacing w:after="40"/>
+        <w:ind w:left="403"/>
+      </w:pPr>
+      <w:hyperlink w:anchor="section_3_1">
+        <w:r>
+          <w:rPr>
+            <w:color w:val="0563C1"/>
+            <w:u w:val="single"/>
+          </w:rPr>
+          <w:t>3.1 Core Theory and Derivation</w:t>
+        </w:r>
+      </w:hyperlink>
+    </w:p>
+    <w:p>
+      <w:pPr>
+        <w:spacing w:after="40"/>
+        <w:ind w:left="403"/>
+      </w:pPr>
+      <w:hyperlink w:anchor="section_3_2">
+        <w:r>
+          <w:rPr>
+            <w:color w:val="0563C1"/>
+            <w:u w:val="single"/>
+          </w:rPr>
+          <w:t>3.2 Real-World Application Box</w:t>
+        </w:r>
+      </w:hyperlink>
+    </w:p>
+    <w:p>
+      <w:pPr>
+        <w:spacing w:after="40"/>
+        <w:ind w:left="403"/>
+      </w:pPr>
+      <w:hyperlink w:anchor="section_3_3">
+        <w:r>
+          <w:rPr>
+            <w:color w:val="0563C1"/>
+            <w:u w:val="single"/>
+          </w:rPr>
+          <w:t>3.3 Tiered Worked Examples</w:t>
+        </w:r>
+      </w:hyperlink>
+    </w:p>
+    <w:p>
+      <w:pPr>
+        <w:spacing w:after="40"/>
+        <w:ind w:left="403"/>
+      </w:pPr>
+      <w:hyperlink w:anchor="section_3_4">
+        <w:r>
+          <w:rPr>
+            <w:color w:val="0563C1"/>
+            <w:u w:val="single"/>
+          </w:rPr>
+          <w:t>3.4 Formula Summary</w:t>
+        </w:r>
+      </w:hyperlink>
+    </w:p>
+    <w:p>
+      <w:pPr>
+        <w:spacing w:after="40"/>
+        <w:ind w:left="0"/>
+      </w:pPr>
+      <w:hyperlink w:anchor="chapter_4">
+        <w:r>
+          <w:rPr>
+            <w:color w:val="0563C1"/>
+            <w:u w:val="single"/>
+          </w:rPr>
+          <w:t>Chapter 4 The Chain Rule: Foundations and Rigorous Derivation</w:t>
+        </w:r>
+      </w:hyperlink>
+    </w:p>
+    <w:p>
+      <w:pPr>
+        <w:spacing w:after="40"/>
+        <w:ind w:left="403"/>
+      </w:pPr>
+      <w:hyperlink w:anchor="section_4_0">
+        <w:r>
+          <w:rPr>
+            <w:color w:val="0563C1"/>
+            <w:u w:val="single"/>
+          </w:rPr>
+          <w:t>4.0 Learning Objectives</w:t>
+        </w:r>
+      </w:hyperlink>
+    </w:p>
+    <w:p>
+      <w:pPr>
+        <w:spacing w:after="40"/>
+        <w:ind w:left="403"/>
+      </w:pPr>
+      <w:hyperlink w:anchor="section_4_1">
+        <w:r>
+          <w:rPr>
+            <w:color w:val="0563C1"/>
+            <w:u w:val="single"/>
+          </w:rPr>
+          <w:t>4.1 Core Theory and Derivation</w:t>
+        </w:r>
+      </w:hyperlink>
+    </w:p>
+    <w:p>
+      <w:pPr>
+        <w:spacing w:after="40"/>
+        <w:ind w:left="403"/>
+      </w:pPr>
+      <w:hyperlink w:anchor="section_4_2">
+        <w:r>
+          <w:rPr>
+            <w:color w:val="0563C1"/>
+            <w:u w:val="single"/>
+          </w:rPr>
+          <w:t>4.2 Real-World Application Box</w:t>
+        </w:r>
+      </w:hyperlink>
+    </w:p>
+    <w:p>
+      <w:pPr>
+        <w:spacing w:after="40"/>
+        <w:ind w:left="403"/>
+      </w:pPr>
+      <w:hyperlink w:anchor="section_4_3">
+        <w:r>
+          <w:rPr>
+            <w:color w:val="0563C1"/>
+            <w:u w:val="single"/>
+          </w:rPr>
+          <w:t>4.3 Tiered Worked Examples</w:t>
+        </w:r>
+      </w:hyperlink>
+    </w:p>
+    <w:p>
+      <w:pPr>
+        <w:spacing w:after="40"/>
+        <w:ind w:left="403"/>
+      </w:pPr>
+      <w:hyperlink w:anchor="section_4_4">
+        <w:r>
+          <w:rPr>
+            <w:color w:val="0563C1"/>
+            <w:u w:val="single"/>
+          </w:rPr>
+          <w:t>4.4 Formula Summary</w:t>
+        </w:r>
+      </w:hyperlink>
+    </w:p>
+    <w:p>
+      <w:pPr>
         <w:pStyle w:val="Heading1"/>
       </w:pPr>
+      <w:bookmarkStart w:id="1" w:name="chapter_1"/>
       <w:r>
         <w:rPr>
           <w:lang w:val="en-US"/>
         </w:rPr>
         <w:t>Chapter 1 Foundations of the Derivative and the Difference Quotient</w:t>
       </w:r>
+      <w:bookmarkEnd w:id="1"/>
     </w:p>
     <w:p>
       <w:pPr>
         <w:pStyle w:val="Heading2"/>
       </w:pPr>
+      <w:bookmarkStart w:id="2" w:name="section_1_0"/>
       <w:r>
         <w:rPr>
           <w:lang w:val="en-US"/>
         </w:rPr>
         <w:t>1.0 Learning Objectives</w:t>
       </w:r>
+      <w:bookmarkEnd w:id="2"/>
     </w:p>
     <w:p>
       <w:r>
@@ -716,12 +1072,14 @@
       <w:pPr>
         <w:pStyle w:val="Heading2"/>
       </w:pPr>
+      <w:bookmarkStart w:id="3" w:name="section_1_1"/>
       <w:r>
         <w:rPr>
           <w:lang w:val="en-US"/>
         </w:rPr>
         <w:t>1.1 Core Theory and Derivation</w:t>
       </w:r>
+      <w:bookmarkEnd w:id="3"/>
     </w:p>
     <w:p>
       <w:r>
@@ -1882,12 +2240,14 @@
       <w:pPr>
         <w:pStyle w:val="Heading2"/>
       </w:pPr>
+      <w:bookmarkStart w:id="4" w:name="section_1_2"/>
       <w:r>
         <w:rPr>
           <w:lang w:val="en-US"/>
         </w:rPr>
         <w:t>1.2 Real-World Application Box</w:t>
       </w:r>
+      <w:bookmarkEnd w:id="4"/>
     </w:p>
     <w:p>
       <w:pPr>
@@ -2548,12 +2908,14 @@
       <w:pPr>
         <w:pStyle w:val="Heading2"/>
       </w:pPr>
+      <w:bookmarkStart w:id="5" w:name="section_1_3"/>
       <w:r>
         <w:rPr>
           <w:lang w:val="en-US"/>
         </w:rPr>
         <w:t>1.3 Tiered Worked Examples</w:t>
       </w:r>
+      <w:bookmarkEnd w:id="5"/>
     </w:p>
     <w:p>
       <w:r>
@@ -3462,12 +3824,14 @@
       <w:pPr>
         <w:pStyle w:val="Heading2"/>
       </w:pPr>
+      <w:bookmarkStart w:id="6" w:name="section_1_4"/>
       <w:r>
         <w:rPr>
           <w:lang w:val="en-US"/>
         </w:rPr>
         <w:t>1.4 Formula Summary</w:t>
       </w:r>
+      <w:bookmarkEnd w:id="6"/>
     </w:p>
     <w:p>
       <w:r>
@@ -4721,23 +5085,27 @@
       <w:pPr>
         <w:pStyle w:val="Heading1"/>
       </w:pPr>
+      <w:bookmarkStart w:id="7" w:name="chapter_2"/>
       <w:r>
         <w:rPr>
           <w:lang w:val="en-US"/>
         </w:rPr>
         <w:t>Chapter 2 Basic Differentiation Theorems, Constant, Power, and Sum Rules</w:t>
       </w:r>
+      <w:bookmarkEnd w:id="7"/>
     </w:p>
     <w:p>
       <w:pPr>
         <w:pStyle w:val="Heading2"/>
       </w:pPr>
+      <w:bookmarkStart w:id="8" w:name="section_2_0"/>
       <w:r>
         <w:rPr>
           <w:lang w:val="en-US"/>
         </w:rPr>
         <w:t>2.0 Learning Objectives</w:t>
       </w:r>
+      <w:bookmarkEnd w:id="8"/>
     </w:p>
     <w:p>
       <w:r>
@@ -5251,12 +5619,14 @@
       <w:pPr>
         <w:pStyle w:val="Heading2"/>
       </w:pPr>
+      <w:bookmarkStart w:id="9" w:name="section_2_1"/>
       <w:r>
         <w:rPr>
           <w:lang w:val="en-US"/>
         </w:rPr>
         <w:t>2.1 Core Theory and Derivation</w:t>
       </w:r>
+      <w:bookmarkEnd w:id="9"/>
     </w:p>
     <w:p>
       <w:r>
@@ -6081,12 +6451,14 @@
       <w:pPr>
         <w:pStyle w:val="Heading2"/>
       </w:pPr>
+      <w:bookmarkStart w:id="10" w:name="section_2_2"/>
       <w:r>
         <w:rPr>
           <w:lang w:val="en-US"/>
         </w:rPr>
         <w:t>2.2 Real-World Application Box</w:t>
       </w:r>
+      <w:bookmarkEnd w:id="10"/>
     </w:p>
     <w:p>
       <w:pPr>
@@ -6553,12 +6925,14 @@
       <w:pPr>
         <w:pStyle w:val="Heading2"/>
       </w:pPr>
+      <w:bookmarkStart w:id="11" w:name="section_2_3"/>
       <w:r>
         <w:rPr>
           <w:lang w:val="en-US"/>
         </w:rPr>
         <w:t>2.3 Tiered Worked Examples</w:t>
       </w:r>
+      <w:bookmarkEnd w:id="11"/>
     </w:p>
     <w:p>
       <w:r>
@@ -7312,12 +7686,14 @@
       <w:pPr>
         <w:pStyle w:val="Heading2"/>
       </w:pPr>
+      <w:bookmarkStart w:id="12" w:name="section_2_4"/>
       <w:r>
         <w:rPr>
           <w:lang w:val="en-US"/>
         </w:rPr>
         <w:t>2.4 Formula Summary</w:t>
       </w:r>
+      <w:bookmarkEnd w:id="12"/>
     </w:p>
     <w:p>
       <w:r>
@@ -8166,23 +8542,27 @@
       <w:pPr>
         <w:pStyle w:val="Heading1"/>
       </w:pPr>
+      <w:bookmarkStart w:id="13" w:name="chapter_3"/>
       <w:r>
         <w:rPr>
           <w:lang w:val="en-US"/>
         </w:rPr>
         <w:t>Chapter 3 The Product and Quotient Rules</w:t>
       </w:r>
+      <w:bookmarkEnd w:id="13"/>
     </w:p>
     <w:p>
       <w:pPr>
         <w:pStyle w:val="Heading2"/>
       </w:pPr>
+      <w:bookmarkStart w:id="14" w:name="section_3_0"/>
       <w:r>
         <w:rPr>
           <w:lang w:val="en-US"/>
         </w:rPr>
         <w:t>3.0 Learning Objectives</w:t>
       </w:r>
+      <w:bookmarkEnd w:id="14"/>
     </w:p>
     <w:p>
       <w:r>
@@ -8655,12 +9035,14 @@
       <w:pPr>
         <w:pStyle w:val="Heading2"/>
       </w:pPr>
+      <w:bookmarkStart w:id="15" w:name="section_3_1"/>
       <w:r>
         <w:rPr>
           <w:lang w:val="en-US"/>
         </w:rPr>
         <w:t>3.1 Core Theory and Derivation</w:t>
       </w:r>
+      <w:bookmarkEnd w:id="15"/>
     </w:p>
     <w:p>
       <w:r>
@@ -10009,12 +10391,14 @@
       <w:pPr>
         <w:pStyle w:val="Heading2"/>
       </w:pPr>
+      <w:bookmarkStart w:id="16" w:name="section_3_2"/>
       <w:r>
         <w:rPr>
           <w:lang w:val="en-US"/>
         </w:rPr>
         <w:t>3.2 Real-World Application Box</w:t>
       </w:r>
+      <w:bookmarkEnd w:id="16"/>
     </w:p>
     <w:p>
       <w:pPr>
@@ -10653,12 +11037,14 @@
       <w:pPr>
         <w:pStyle w:val="Heading2"/>
       </w:pPr>
+      <w:bookmarkStart w:id="17" w:name="section_3_3"/>
       <w:r>
         <w:rPr>
           <w:lang w:val="en-US"/>
         </w:rPr>
         <w:t>3.3 Tiered Worked Examples</w:t>
       </w:r>
+      <w:bookmarkEnd w:id="17"/>
     </w:p>
     <w:p>
       <w:r>
@@ -11467,12 +11853,14 @@
       <w:pPr>
         <w:pStyle w:val="Heading2"/>
       </w:pPr>
+      <w:bookmarkStart w:id="18" w:name="section_3_4"/>
       <w:r>
         <w:rPr>
           <w:lang w:val="en-US"/>
         </w:rPr>
         <w:t>3.4 Formula Summary</w:t>
       </w:r>
+      <w:bookmarkEnd w:id="18"/>
     </w:p>
     <w:p>
       <w:r>
@@ -12844,23 +13232,27 @@
       <w:pPr>
         <w:pStyle w:val="Heading1"/>
       </w:pPr>
+      <w:bookmarkStart w:id="19" w:name="chapter_4"/>
       <w:r>
         <w:rPr>
           <w:lang w:val="en-US"/>
         </w:rPr>
         <w:t>Chapter 4 The Chain Rule: Foundations and Rigorous Derivation</w:t>
       </w:r>
+      <w:bookmarkEnd w:id="19"/>
     </w:p>
     <w:p>
       <w:pPr>
         <w:pStyle w:val="Heading2"/>
       </w:pPr>
+      <w:bookmarkStart w:id="20" w:name="section_4_0"/>
       <w:r>
         <w:rPr>
           <w:lang w:val="en-US"/>
         </w:rPr>
         <w:t>4.0 Learning Objectives</w:t>
       </w:r>
+      <w:bookmarkEnd w:id="20"/>
     </w:p>
     <w:p>
       <w:r>
@@ -13358,12 +13750,14 @@
       <w:pPr>
         <w:pStyle w:val="Heading2"/>
       </w:pPr>
+      <w:bookmarkStart w:id="21" w:name="section_4_1"/>
       <w:r>
         <w:rPr>
           <w:lang w:val="en-US"/>
         </w:rPr>
         <w:t>4.1 Core Theory and Derivation</w:t>
       </w:r>
+      <w:bookmarkEnd w:id="21"/>
     </w:p>
     <w:p>
       <w:r>
@@ -14892,12 +15286,14 @@
       <w:pPr>
         <w:pStyle w:val="Heading2"/>
       </w:pPr>
+      <w:bookmarkStart w:id="22" w:name="section_4_2"/>
       <w:r>
         <w:rPr>
           <w:lang w:val="en-US"/>
         </w:rPr>
         <w:t>4.2 Real-World Application Box</w:t>
       </w:r>
+      <w:bookmarkEnd w:id="22"/>
     </w:p>
     <w:p>
       <w:pPr>
@@ -15589,12 +15985,14 @@
       <w:pPr>
         <w:pStyle w:val="Heading2"/>
       </w:pPr>
+      <w:bookmarkStart w:id="23" w:name="section_4_3"/>
       <w:r>
         <w:rPr>
           <w:lang w:val="en-US"/>
         </w:rPr>
         <w:t>4.3 Tiered Worked Examples</w:t>
       </w:r>
+      <w:bookmarkEnd w:id="23"/>
     </w:p>
     <w:p>
       <w:r>
@@ -16349,12 +16747,14 @@
       <w:pPr>
         <w:pStyle w:val="Heading2"/>
       </w:pPr>
+      <w:bookmarkStart w:id="24" w:name="section_4_4"/>
       <w:r>
         <w:rPr>
           <w:lang w:val="en-US"/>
         </w:rPr>
         <w:t>4.4 Formula Summary</w:t>
       </w:r>
+      <w:bookmarkEnd w:id="24"/>
     </w:p>
     <w:p>
       <w:r>

</xml_diff>